<commit_message>
fix: orthographe officielle ISEP Amadou Trawaré partout, balises dans le cartouche du rapport PDF, rapport regenere
Co-Authored-By: Claude Sonnet 5.5 <noreply@anthropic.com>
</commit_message>
<xml_diff>
--- a/docs/livrables/rapport_projet.docx
+++ b/docs/livrables/rapport_projet.docx
@@ -91,7 +91,7 @@
               </w:rPr>
               <w:t>Développement de Solutions Numériques pour le CIAT et son Incubateur</w:t>
               <w:br/>
-              <w:t>Établissement : Institut Supérieur d'Enseignement Professionnel (ISEP) Amadou Traoré de Diamniadio</w:t>
+              <w:t>Établissement : Institut Supérieur d'Enseignement Professionnel (ISEP) Amadou Trawaré de Diamniadio</w:t>
               <w:br/>
               <w:t>Auteur : Lansana Coly (Lead technique)</w:t>
               <w:br/>
@@ -302,7 +302,7 @@
           <w:color w:val="24140D"/>
           <w:sz w:val="20"/>
         </w:rPr>
-        <w:t>Implanté au sein de l'ISEP Amadou Traoré de Diamniadio, le Centre d'Innovation, d'Application et de Transfert (CIAT) constitue un levier stratégique de transfert technologique et d'incubation entrepreneuriale au Sénégal. Sa vocation est d'accompagner les porteurs de projets innovants, d'accélérer le passage de l'idée au prototype industriel et de rapprocher la formation professionnelle des besoins réels des filières économiques (agroécologie, énergies renouvelables, intelligence artificielle, fabrication mécanique, santé).</w:t>
+        <w:t>Implanté au sein de l'ISEP Amadou Trawaré de Diamniadio, le Centre d'Innovation, d'Application et de Transfert (CIAT) constitue un levier stratégique de transfert technologique et d'incubation entrepreneuriale au Sénégal. Sa vocation est d'accompagner les porteurs de projets innovants, d'accélérer le passage de l'idée au prototype industriel et de rapprocher la formation professionnelle des besoins réels des filières économiques (agroécologie, énergies renouvelables, intelligence artificielle, fabrication mécanique, santé).</w:t>
       </w:r>
     </w:p>
     <w:p>
@@ -3456,7 +3456,7 @@
           <w:color w:val="24140D"/>
           <w:sz w:val="20"/>
         </w:rPr>
-        <w:t>La plateforme numérique du CIAT conçue et livrée lors de cette évaluation pratique constitue une réponse technique complète, rigoureuse et pérenne aux défis d'accompagnement de l'ISEP Amadou Traoré de Diamniadio. En mariant la solidité d'une modélisation relationnelle de 34 tables, une étanchéité de droits garantie par une matrice RBAC à 6 rôles, et une intégration de l'IA générative strictement encadrée par des garde-fous anti-hallucination, la solution démontre qu'il est possible de mobiliser l'intelligence artificielle au service de l'action publique et académique sans jamais sacrifier la sécurité, la souveraineté des données ni la rigueur méthodologique.</w:t>
+        <w:t>La plateforme numérique du CIAT conçue et livrée lors de cette évaluation pratique constitue une réponse technique complète, rigoureuse et pérenne aux défis d'accompagnement de l'ISEP Amadou Trawaré de Diamniadio. En mariant la solidité d'une modélisation relationnelle de 34 tables, une étanchéité de droits garantie par une matrice RBAC à 6 rôles, et une intégration de l'IA générative strictement encadrée par des garde-fous anti-hallucination, la solution démontre qu'il est possible de mobiliser l'intelligence artificielle au service de l'action publique et académique sans jamais sacrifier la sécurité, la souveraineté des données ni la rigueur méthodologique.</w:t>
       </w:r>
     </w:p>
     <w:p>

</xml_diff>

<commit_message>
phase5-t4: coherence institutionnelle, auteurs des livrables, generation des pdf portail et journal des prompts
</commit_message>
<xml_diff>
--- a/docs/livrables/rapport_projet.docx
+++ b/docs/livrables/rapport_projet.docx
@@ -93,7 +93,7 @@
               <w:br/>
               <w:t>Établissement : Institut Supérieur d'Enseignement Professionnel (ISEP) Amadou Trawaré de Diamniadio</w:t>
               <w:br/>
-              <w:t>Auteur : Lansana Coly (Lead technique)</w:t>
+              <w:t>Auteur : Groupe de six apprenants : Lansana Coly, Pape Alioune Sène, Maimouna Sall, El Hadji Massogui Diop, Ibrahima Khalilou Diallo, Pathé Fall</w:t>
               <w:br/>
               <w:t>Référence académique : Évaluation pratique du cours d'Intelligence Artificielle Générative (Livrable Obligatoire N° 6)</w:t>
               <w:br/>
@@ -332,6 +332,133 @@
           <w:sz w:val="20"/>
         </w:rPr>
         <w:t>Dans le cadre du cours d'Intelligence Artificielle Générative, l'objectif assigné à l'équipe technique était de concevoir, développer, tester et documenter une solution logicielle complète, interconnectée et immédiatement opérationnelle. Le résultat dépasse le stade d'un prototype jetable : la plateforme CIAT intègre l'ensemble des modules métiers requis, repose sur des bases de données relationnelles consistantes, intègre des garde-fous de sécurité avancés et encadre l'IA générative dans un cadre de confiance strict.</w:t>
+      </w:r>
+    </w:p>
+    <w:p>
+      <w:pPr>
+        <w:keepNext/>
+        <w:spacing w:before="200" w:after="60"/>
+      </w:pPr>
+      <w:r>
+        <w:rPr>
+          <w:rFonts w:ascii="Calibri" w:hAnsi="Calibri"/>
+          <w:b/>
+          <w:color w:val="24140D"/>
+          <w:sz w:val="22"/>
+        </w:rPr>
+        <w:t>1.3 Organisation de l'Équipe et Contribution de Chaque Membre</w:t>
+      </w:r>
+    </w:p>
+    <w:p>
+      <w:pPr>
+        <w:spacing w:after="100" w:line="276" w:lineRule="auto"/>
+        <w:jc w:val="both"/>
+      </w:pPr>
+      <w:r>
+        <w:rPr>
+          <w:rFonts w:ascii="Calibri" w:hAnsi="Calibri"/>
+          <w:color w:val="24140D"/>
+          <w:sz w:val="20"/>
+        </w:rPr>
+        <w:t>Le projet est réalisé par un groupe de six apprenants réunis autour d'une organisation technique rigoureuse, avec une répartition explicite des rôles et des responsabilités par personne :</w:t>
+      </w:r>
+    </w:p>
+    <w:p>
+      <w:pPr>
+        <w:pStyle w:val="ListBullet"/>
+        <w:spacing w:after="60" w:line="276" w:lineRule="auto"/>
+      </w:pPr>
+      <w:r>
+        <w:rPr>
+          <w:rFonts w:ascii="Calibri" w:hAnsi="Calibri"/>
+          <w:color w:val="24140D"/>
+          <w:sz w:val="20"/>
+        </w:rPr>
+        <w:t>Lansana Coly : coordination, architecture, socle, services d'IA, intégration, tests de bout en bout et livrables ;</w:t>
+      </w:r>
+    </w:p>
+    <w:p>
+      <w:pPr>
+        <w:pStyle w:val="ListBullet"/>
+        <w:spacing w:after="60" w:line="276" w:lineRule="auto"/>
+      </w:pPr>
+      <w:r>
+        <w:rPr>
+          <w:rFonts w:ascii="Calibri" w:hAnsi="Calibri"/>
+          <w:color w:val="24140D"/>
+          <w:sz w:val="20"/>
+        </w:rPr>
+        <w:t>Pape Alioune Sène : tableau de bord, données, indicateurs, qualité des données, tests de l'interface ;</w:t>
+      </w:r>
+    </w:p>
+    <w:p>
+      <w:pPr>
+        <w:pStyle w:val="ListBullet"/>
+        <w:spacing w:after="60" w:line="276" w:lineRule="auto"/>
+      </w:pPr>
+      <w:r>
+        <w:rPr>
+          <w:rFonts w:ascii="Calibri" w:hAnsi="Calibri"/>
+          <w:color w:val="24140D"/>
+          <w:sz w:val="20"/>
+        </w:rPr>
+        <w:t>Maimouna Sall : parcours du porteur, générateur de documents, suivi et alertes, maquettes ;</w:t>
+      </w:r>
+    </w:p>
+    <w:p>
+      <w:pPr>
+        <w:pStyle w:val="ListBullet"/>
+        <w:spacing w:after="60" w:line="276" w:lineRule="auto"/>
+      </w:pPr>
+      <w:r>
+        <w:rPr>
+          <w:rFonts w:ascii="Calibri" w:hAnsi="Calibri"/>
+          <w:color w:val="24140D"/>
+          <w:sz w:val="20"/>
+        </w:rPr>
+        <w:t>El Hadji Massogui Diop : site public, galerie, assistant, communication et vidéo ;</w:t>
+      </w:r>
+    </w:p>
+    <w:p>
+      <w:pPr>
+        <w:pStyle w:val="ListBullet"/>
+        <w:spacing w:after="60" w:line="276" w:lineRule="auto"/>
+      </w:pPr>
+      <w:r>
+        <w:rPr>
+          <w:rFonts w:ascii="Calibri" w:hAnsi="Calibri"/>
+          <w:color w:val="24140D"/>
+          <w:sz w:val="20"/>
+        </w:rPr>
+        <w:t>Ibrahima Khalilou Diallo : module incubateur, base de données, sécurité, PostgreSQL ;</w:t>
+      </w:r>
+    </w:p>
+    <w:p>
+      <w:pPr>
+        <w:pStyle w:val="ListBullet"/>
+        <w:spacing w:after="60" w:line="276" w:lineRule="auto"/>
+      </w:pPr>
+      <w:r>
+        <w:rPr>
+          <w:rFonts w:ascii="Calibri" w:hAnsi="Calibri"/>
+          <w:color w:val="24140D"/>
+          <w:sz w:val="20"/>
+        </w:rPr>
+        <w:t>Pathé Fall : portail, exports et PDF, statistiques, notifications.</w:t>
+      </w:r>
+    </w:p>
+    <w:p>
+      <w:pPr>
+        <w:spacing w:after="100" w:line="276" w:lineRule="auto"/>
+        <w:jc w:val="both"/>
+      </w:pPr>
+      <w:r>
+        <w:rPr>
+          <w:rFonts w:ascii="Calibri" w:hAnsi="Calibri"/>
+          <w:color w:val="24140D"/>
+          <w:sz w:val="20"/>
+        </w:rPr>
+        <w:t>Les documents de démonstration portent systématiquement la mention : « Version de démonstration rédigée par l'équipe du projet, à valider par l'ISEP ».</w:t>
       </w:r>
     </w:p>
     <w:p>
@@ -3604,7 +3731,7 @@
         <w:color w:val="666666"/>
         <w:sz w:val="17"/>
       </w:rPr>
-      <w:t>Plateforme Numérique CIAT  •  Livrable Obligatoire N° 6  •  Lead technique : Lansana Coly</w:t>
+      <w:t>Plateforme Numérique CIAT  •  Livrable Obligatoire N° 6  •  Groupe de six apprenants : Lansana Coly, Pape Alioune Sène, Maimouna Sall, El Hadji Massogui Diop, Ibrahima Khalilou Diallo, Pathé Fall</w:t>
     </w:r>
   </w:p>
 </w:ftr>

</xml_diff>